<commit_message>
Draft: renumber figure references consecutively (files F7, F8 are Figs 6, 7)
Co-Authored-By: Claude Opus 5.5 (1M context) <noreply@anthropic.com>
</commit_message>
<xml_diff>
--- a/paper_out/draft_methods_results_revised.docx
+++ b/paper_out/draft_methods_results_revised.docx
@@ -4506,7 +4506,7 @@
           <w:b/>
           <w:bCs/>
         </w:rPr>
-        <w:t xml:space="preserve">PC1 and PC2 [C], supported (Fig. 7).</w:t>
+        <w:t xml:space="preserve">PC1 and PC2 [C], supported (Fig. 6).</w:t>
       </w:r>
     </w:p>
     <w:tbl>
@@ -4934,7 +4934,7 @@
         <w:pStyle w:val="FirstParagraph"/>
       </w:pPr>
       <w:r>
-        <w:t xml:space="preserve">Results are based on 500 holdout complaints × 36 guises (GPT-4o-mini bank); see Fig. 8 and Table 8. Gaps are within-complaint contrasts in tiers (GPT-4o-mini) or E[tier] (Jev), with 95% bootstrap CIs.</w:t>
+        <w:t xml:space="preserve">Results are based on 500 holdout complaints × 36 guises (GPT-4o-mini bank); see Fig. 7 and Table 8. Gaps are within-complaint contrasts in tiers (GPT-4o-mini) or E[tier] (Jev), with 95% bootstrap CIs.</w:t>
       </w:r>
     </w:p>
     <w:p>

</xml_diff>

<commit_message>
Post hoc R4: group gaps among fidelity-screened guises (descriptive)
On the 40 audited complaints, excluding guises flagged for material fact
changes leaves GPT-4o-mini and Jev persona gaps essentially unchanged (all
differences near zero, CIs include 0). Added to section 4.8 and Limitations.
R2/R3 results verified unchanged by the re-run. Packager keeps the staged
repo's .git.

Co-Authored-By: Claude Opus 5.5 (1M context) <noreply@anthropic.com>
</commit_message>
<xml_diff>
--- a/paper_out/draft_methods_results_revised.docx
+++ b/paper_out/draft_methods_results_revised.docx
@@ -5826,7 +5826,7 @@
         <w:pStyle w:val="FirstParagraph"/>
       </w:pPr>
       <w:r>
-        <w:t xml:space="preserve">For tier MPAD and E[tier] MPAD the ratios are 1.00 and 0.99. Excluding flagged guises leaves the point estimates of instability almost unchanged. Jev's interval still allows a substantial reduction, and the screen can only remove changes the auditors detected. This supports the individual-instability result. It does not show that the small group gaps survive the exclusion, which this 40-complaint sample cannot test. FA4 (descriptive) points the same way: guises whose GPT-4o-mini monetary decision departs from the complaint's majority were only slightly more often flagged (22% vs 17%).</w:t>
+        <w:t xml:space="preserve">For tier MPAD and E[tier] MPAD the ratios are 1.00 and 0.99. Excluding flagged guises leaves the point estimates of instability almost unchanged. Jev's interval still allows a substantial reduction, and the screen can only remove changes the auditors detected. This supports the individual-instability result.</w:t>
       </w:r>
     </w:p>
     <w:p>
@@ -5838,6 +5838,81 @@
           <w:b/>
           <w:bCs/>
         </w:rPr>
+        <w:t xml:space="preserve">Group gaps among screened guises [PH, descriptive].</w:t>
+      </w:r>
+      <w:r>
+        <w:t xml:space="preserve"> </w:t>
+      </w:r>
+      <w:r>
+        <w:t xml:space="preserve">On the same 40 complaints (weighted), we compared the persona gaps computed from all guises with those computed only from guises that passed the screen. Excluding flagged guises left every gap essentially unchanged:</w:t>
+      </w:r>
+    </w:p>
+    <w:p>
+      <w:pPr>
+        <w:pStyle w:val="Compact"/>
+        <w:numPr>
+          <w:ilvl w:val="0"/>
+          <w:numId w:val="1055"/>
+        </w:numPr>
+      </w:pPr>
+      <w:r>
+        <w:t xml:space="preserve">GPT-4o-mini tier: the all-minus-screened difference is +0.004 for age [−0.015, 0.022], +0.006 for education [−0.012, 0.030] and −0.002 for SES [−0.018, 0.014];</w:t>
+      </w:r>
+    </w:p>
+    <w:p>
+      <w:pPr>
+        <w:pStyle w:val="Compact"/>
+        <w:numPr>
+          <w:ilvl w:val="0"/>
+          <w:numId w:val="1055"/>
+        </w:numPr>
+      </w:pPr>
+      <w:r>
+        <w:t xml:space="preserve">Jev E[tier]: +0.001 [−0.003, 0.004], 0.000 [−0.005, 0.005] and −0.007 [−0.017, 0.001];</w:t>
+      </w:r>
+    </w:p>
+    <w:p>
+      <w:pPr>
+        <w:pStyle w:val="Compact"/>
+        <w:numPr>
+          <w:ilvl w:val="0"/>
+          <w:numId w:val="1055"/>
+        </w:numPr>
+      </w:pPr>
+      <w:r>
+        <w:t xml:space="preserve">GPT-4o-mini monetary rate: −0.27 to −0.28 pp. Here the screened gaps are slightly</w:t>
+      </w:r>
+      <w:r>
+        <w:t xml:space="preserve"> </w:t>
+      </w:r>
+      <w:r>
+        <w:rPr>
+          <w:i/>
+          <w:iCs/>
+        </w:rPr>
+        <w:t xml:space="preserve">larger</w:t>
+      </w:r>
+      <w:r>
+        <w:t xml:space="preserve">, and every interval includes zero.</w:t>
+      </w:r>
+    </w:p>
+    <w:p>
+      <w:pPr>
+        <w:pStyle w:val="FirstParagraph"/>
+      </w:pPr>
+      <w:r>
+        <w:t xml:space="preserve">For example, GPT-4o-mini's SES tier gap is +0.045 [0.005, 0.084] with all guises and +0.047 [0.007, 0.089] with screened guises only. The gaps themselves are imprecise in a 40-complaint sample, and the non-unanimous stratum is oversampled before weighting, so their levels are not comparable with the full-panel estimates. What the comparison shows is that the flagged fact changes do not account for the persona gaps. FA4 (descriptive) points the same way: guises whose GPT-4o-mini monetary decision departs from the complaint's majority were only slightly more often flagged (22% vs 17%).</w:t>
+      </w:r>
+    </w:p>
+    <w:p>
+      <w:pPr>
+        <w:pStyle w:val="BodyText"/>
+      </w:pPr>
+      <w:r>
+        <w:rPr>
+          <w:b/>
+          <w:bCs/>
+        </w:rPr>
         <w:t xml:space="preserve">FA5 [C, estimation]: the standardising rewrites change facts less often.</w:t>
       </w:r>
       <w:r>
@@ -5888,7 +5963,7 @@
         <w:pStyle w:val="Compact"/>
         <w:numPr>
           <w:ilvl w:val="0"/>
-          <w:numId w:val="1055"/>
+          <w:numId w:val="1056"/>
         </w:numPr>
       </w:pPr>
       <w:r>
@@ -5900,7 +5975,7 @@
         <w:pStyle w:val="Compact"/>
         <w:numPr>
           <w:ilvl w:val="0"/>
-          <w:numId w:val="1055"/>
+          <w:numId w:val="1056"/>
         </w:numPr>
       </w:pPr>
       <w:r>
@@ -6082,7 +6157,7 @@
       <w:pPr>
         <w:numPr>
           <w:ilvl w:val="0"/>
-          <w:numId w:val="1056"/>
+          <w:numId w:val="1057"/>
         </w:numPr>
       </w:pPr>
       <w:r>
@@ -6103,7 +6178,7 @@
       <w:pPr>
         <w:numPr>
           <w:ilvl w:val="0"/>
-          <w:numId w:val="1056"/>
+          <w:numId w:val="1057"/>
         </w:numPr>
       </w:pPr>
       <w:r>
@@ -6124,7 +6199,7 @@
       <w:pPr>
         <w:numPr>
           <w:ilvl w:val="0"/>
-          <w:numId w:val="1056"/>
+          <w:numId w:val="1057"/>
         </w:numPr>
       </w:pPr>
       <w:r>
@@ -6145,7 +6220,7 @@
       <w:pPr>
         <w:numPr>
           <w:ilvl w:val="0"/>
-          <w:numId w:val="1056"/>
+          <w:numId w:val="1057"/>
         </w:numPr>
       </w:pPr>
       <w:r>
@@ -6166,7 +6241,7 @@
       <w:pPr>
         <w:numPr>
           <w:ilvl w:val="0"/>
-          <w:numId w:val="1056"/>
+          <w:numId w:val="1057"/>
         </w:numPr>
       </w:pPr>
       <w:r>
@@ -6213,7 +6288,7 @@
       <w:pPr>
         <w:numPr>
           <w:ilvl w:val="0"/>
-          <w:numId w:val="1057"/>
+          <w:numId w:val="1058"/>
         </w:numPr>
       </w:pPr>
       <w:r>
@@ -6234,7 +6309,7 @@
       <w:pPr>
         <w:numPr>
           <w:ilvl w:val="0"/>
-          <w:numId w:val="1057"/>
+          <w:numId w:val="1058"/>
         </w:numPr>
       </w:pPr>
       <w:r>
@@ -6255,7 +6330,7 @@
       <w:pPr>
         <w:numPr>
           <w:ilvl w:val="0"/>
-          <w:numId w:val="1057"/>
+          <w:numId w:val="1058"/>
         </w:numPr>
       </w:pPr>
       <w:r>
@@ -6294,7 +6369,7 @@
       <w:pPr>
         <w:numPr>
           <w:ilvl w:val="0"/>
-          <w:numId w:val="1058"/>
+          <w:numId w:val="1059"/>
         </w:numPr>
       </w:pPr>
       <w:r>
@@ -6305,7 +6380,7 @@
       <w:pPr>
         <w:numPr>
           <w:ilvl w:val="0"/>
-          <w:numId w:val="1058"/>
+          <w:numId w:val="1059"/>
         </w:numPr>
       </w:pPr>
       <w:r>
@@ -6316,7 +6391,7 @@
       <w:pPr>
         <w:numPr>
           <w:ilvl w:val="0"/>
-          <w:numId w:val="1058"/>
+          <w:numId w:val="1059"/>
         </w:numPr>
       </w:pPr>
       <w:r>
@@ -6353,7 +6428,7 @@
       <w:pPr>
         <w:numPr>
           <w:ilvl w:val="0"/>
-          <w:numId w:val="1059"/>
+          <w:numId w:val="1060"/>
         </w:numPr>
       </w:pPr>
       <w:r>
@@ -6374,7 +6449,7 @@
       <w:pPr>
         <w:numPr>
           <w:ilvl w:val="0"/>
-          <w:numId w:val="1059"/>
+          <w:numId w:val="1060"/>
         </w:numPr>
       </w:pPr>
       <w:r>
@@ -6388,14 +6463,14 @@
         <w:t xml:space="preserve"> </w:t>
       </w:r>
       <w:r>
-        <w:t xml:space="preserve">Individual auditors flagged a material fact change in 3.3% and 11.7% of persona guises, and 13.2% were flagged by either (§4.8). The instability result holds among guises that passed the screen (FA3), but the group-gap estimates include flagged guises. Agreement between the auditors on persona guises was low (κ = 0.16), and neither auditor was validated against human annotation.</w:t>
-      </w:r>
-    </w:p>
-    <w:p>
-      <w:pPr>
-        <w:numPr>
-          <w:ilvl w:val="0"/>
-          <w:numId w:val="1059"/>
+        <w:t xml:space="preserve">Individual auditors flagged a material fact change in 3.3% and 11.7% of persona guises, and 13.2% were flagged by either (§4.8). The instability result holds among guises that passed the screen (FA3). In the audited complaints, excluding flagged guises also left the group gaps essentially unchanged (§4.8), but the main group-gap estimates still include unaudited guises. Agreement between the auditors on persona guises was low (κ = 0.16), and neither auditor was validated against human annotation.</w:t>
+      </w:r>
+    </w:p>
+    <w:p>
+      <w:pPr>
+        <w:numPr>
+          <w:ilvl w:val="0"/>
+          <w:numId w:val="1060"/>
         </w:numPr>
       </w:pPr>
       <w:r>
@@ -6416,7 +6491,7 @@
       <w:pPr>
         <w:numPr>
           <w:ilvl w:val="0"/>
-          <w:numId w:val="1059"/>
+          <w:numId w:val="1060"/>
         </w:numPr>
       </w:pPr>
       <w:r>
@@ -6437,7 +6512,7 @@
       <w:pPr>
         <w:numPr>
           <w:ilvl w:val="0"/>
-          <w:numId w:val="1059"/>
+          <w:numId w:val="1060"/>
         </w:numPr>
       </w:pPr>
       <w:r>
@@ -6458,7 +6533,7 @@
       <w:pPr>
         <w:numPr>
           <w:ilvl w:val="0"/>
-          <w:numId w:val="1059"/>
+          <w:numId w:val="1060"/>
         </w:numPr>
       </w:pPr>
       <w:r>
@@ -6479,7 +6554,7 @@
       <w:pPr>
         <w:numPr>
           <w:ilvl w:val="0"/>
-          <w:numId w:val="1059"/>
+          <w:numId w:val="1060"/>
         </w:numPr>
       </w:pPr>
       <w:r>
@@ -6500,7 +6575,7 @@
       <w:pPr>
         <w:numPr>
           <w:ilvl w:val="0"/>
-          <w:numId w:val="1059"/>
+          <w:numId w:val="1060"/>
         </w:numPr>
       </w:pPr>
       <w:r>
@@ -6521,7 +6596,7 @@
       <w:pPr>
         <w:numPr>
           <w:ilvl w:val="0"/>
-          <w:numId w:val="1059"/>
+          <w:numId w:val="1060"/>
         </w:numPr>
       </w:pPr>
       <w:r>
@@ -6542,7 +6617,7 @@
       <w:pPr>
         <w:numPr>
           <w:ilvl w:val="0"/>
-          <w:numId w:val="1059"/>
+          <w:numId w:val="1060"/>
         </w:numPr>
       </w:pPr>
       <w:r>
@@ -6563,7 +6638,7 @@
       <w:pPr>
         <w:numPr>
           <w:ilvl w:val="0"/>
-          <w:numId w:val="1059"/>
+          <w:numId w:val="1060"/>
         </w:numPr>
       </w:pPr>
       <w:r>
@@ -6649,7 +6724,7 @@
       <w:pPr>
         <w:numPr>
           <w:ilvl w:val="0"/>
-          <w:numId w:val="1060"/>
+          <w:numId w:val="1061"/>
         </w:numPr>
       </w:pPr>
       <w:r>
@@ -6670,7 +6745,7 @@
       <w:pPr>
         <w:numPr>
           <w:ilvl w:val="0"/>
-          <w:numId w:val="1060"/>
+          <w:numId w:val="1061"/>
         </w:numPr>
       </w:pPr>
       <w:r>
@@ -6691,7 +6766,7 @@
       <w:pPr>
         <w:numPr>
           <w:ilvl w:val="0"/>
-          <w:numId w:val="1060"/>
+          <w:numId w:val="1061"/>
         </w:numPr>
       </w:pPr>
       <w:r>
@@ -7712,7 +7787,42 @@
               <w:pStyle w:val="Compact"/>
             </w:pPr>
             <w:r>
-              <w:t xml:space="preserve">22 Oct</w:t>
+              <w:t xml:space="preserve">22 Oct 08:00</w:t>
+            </w:r>
+          </w:p>
+        </w:tc>
+        <w:tc>
+          <w:tcPr/>
+          <w:p>
+            <w:pPr>
+              <w:pStyle w:val="Compact"/>
+            </w:pPr>
+            <w:r>
+              <w:t xml:space="preserve">29ddd6e</w:t>
+            </w:r>
+          </w:p>
+        </w:tc>
+        <w:tc>
+          <w:tcPr/>
+          <w:p>
+            <w:pPr>
+              <w:pStyle w:val="Compact"/>
+            </w:pPr>
+            <w:r>
+              <w:t xml:space="preserve">Post hoc remedy rules re-run with exact volume matching (§3.9)</w:t>
+            </w:r>
+          </w:p>
+        </w:tc>
+      </w:tr>
+      <w:tr>
+        <w:tc>
+          <w:tcPr/>
+          <w:p>
+            <w:pPr>
+              <w:pStyle w:val="Compact"/>
+            </w:pPr>
+            <w:r>
+              <w:t xml:space="preserve">22 Oct 16:40</w:t>
             </w:r>
           </w:p>
         </w:tc>
@@ -7734,7 +7844,7 @@
               <w:pStyle w:val="Compact"/>
             </w:pPr>
             <w:r>
-              <w:t xml:space="preserve">Post hoc remedy rules re-run with exact volume matching (§3.9)</w:t>
+              <w:t xml:space="preserve">Post hoc, descriptive: group gaps among guises that passed the fidelity screen (§4.8)</w:t>
             </w:r>
           </w:p>
         </w:tc>
@@ -10116,6 +10226,9 @@
     <w:abstractNumId w:val="991"/>
   </w:num>
   <w:num w:numId="1056">
+    <w:abstractNumId w:val="991"/>
+  </w:num>
+  <w:num w:numId="1057">
     <w:abstractNumId w:val="99411"/>
     <w:lvlOverride w:ilvl="0">
       <w:startOverride w:val="1"/>
@@ -10145,9 +10258,6 @@
       <w:startOverride w:val="1"/>
     </w:lvlOverride>
   </w:num>
-  <w:num w:numId="1057">
-    <w:abstractNumId w:val="991"/>
-  </w:num>
   <w:num w:numId="1058">
     <w:abstractNumId w:val="991"/>
   </w:num>
@@ -10155,6 +10265,9 @@
     <w:abstractNumId w:val="991"/>
   </w:num>
   <w:num w:numId="1060">
+    <w:abstractNumId w:val="991"/>
+  </w:num>
+  <w:num w:numId="1061">
     <w:abstractNumId w:val="991"/>
   </w:num>
 </w:numbering>

</xml_diff>

<commit_message>
Insert anonymous repository URL (section 3.7, Appendix B, ethics); include redacted prereg README in package
Co-Authored-By: Claude Opus 5.5 (1M context) <noreply@anthropic.com>
</commit_message>
<xml_diff>
--- a/paper_out/draft_methods_results_revised.docx
+++ b/paper_out/draft_methods_results_revised.docx
@@ -2,7 +2,7 @@
 <file path=word/document.xml><?xml version="1.0" encoding="utf-8"?>
 <w:document xmlns:w="http://schemas.openxmlformats.org/wordprocessingml/2006/main" xmlns:m="http://schemas.openxmlformats.org/officeDocument/2006/math" xmlns:r="http://schemas.openxmlformats.org/officeDocument/2006/relationships" xmlns:o="urn:schemas-microsoft-com:office:office" xmlns:v="urn:schemas-microsoft-com:vml" xmlns:w10="urn:schemas-microsoft-com:office:word" xmlns:a="http://schemas.openxmlformats.org/drawingml/2006/main" xmlns:pic="http://schemas.openxmlformats.org/drawingml/2006/picture" xmlns:wp="http://schemas.openxmlformats.org/drawingml/2006/wordprocessingDrawing">
   <w:body>
-    <w:bookmarkStart w:id="49" w:name="X185c392d9d19d522b2e6940707c541b93c8fbd7"/>
+    <w:bookmarkStart w:id="50" w:name="X185c392d9d19d522b2e6940707c541b93c8fbd7"/>
     <w:p>
       <w:pPr>
         <w:pStyle w:val="Heading1"/>
@@ -1646,7 +1646,7 @@
       </w:r>
     </w:p>
     <w:bookmarkEnd w:id="16"/>
-    <w:bookmarkStart w:id="27" w:name="X167a2da0345881bf36eef0606d50b1063a572d3"/>
+    <w:bookmarkStart w:id="28" w:name="X167a2da0345881bf36eef0606d50b1063a572d3"/>
     <w:p>
       <w:pPr>
         <w:pStyle w:val="Heading2"/>
@@ -2466,7 +2466,7 @@
       </w:r>
     </w:p>
     <w:bookmarkEnd w:id="22"/>
-    <w:bookmarkStart w:id="23" w:name="X3f36966effe11cf2b2b21581b68def17ef09a4e"/>
+    <w:bookmarkStart w:id="24" w:name="X3f36966effe11cf2b2b21581b68def17ef09a4e"/>
     <w:p>
       <w:pPr>
         <w:pStyle w:val="Heading3"/>
@@ -2514,7 +2514,21 @@
         <w:t xml:space="preserve"> </w:t>
       </w:r>
       <w:r>
-        <w:t xml:space="preserve">Five pre-registrations and two amendments were committed to version control before the data they test existed. The frozen documents, analysis scripts, result files and commit timestamps are in the anonymised repository [anonymous URL to be inserted]. Appendix B gives the chronology, and Appendix D the status of every registered hypothesis. They cover the main hypotheses (H1–H6), the attribute hypotheses (H-A1–H-A5), the positive controls (PC1–PC5), the style-standardisation mitigation (MH1–MH5), and the fact-fidelity audit and same-day baseline (FA1–FA6, DB1–DB2).</w:t>
+        <w:t xml:space="preserve">Five pre-registrations and two amendments were committed to version control before the data they test existed. The frozen documents, analysis scripts, result files and commit timestamps are in the anonymised repository</w:t>
+      </w:r>
+      <w:r>
+        <w:t xml:space="preserve"> </w:t>
+      </w:r>
+      <w:hyperlink r:id="rId23">
+        <w:r>
+          <w:rPr>
+            <w:rStyle w:val="Hyperlink"/>
+          </w:rPr>
+          <w:t xml:space="preserve">https://anonymous.4open.science/r/llm-jev-linguistic-profiling-6AC8/</w:t>
+        </w:r>
+      </w:hyperlink>
+      <w:r>
+        <w:t xml:space="preserve">. Appendix B gives the chronology, and Appendix D the status of every registered hypothesis. They cover the main hypotheses (H1–H6), the attribute hypotheses (H-A1–H-A5), the positive controls (PC1–PC5), the style-standardisation mitigation (MH1–MH5), and the fact-fidelity audit and same-day baseline (FA1–FA6, DB1–DB2).</w:t>
       </w:r>
     </w:p>
     <w:p>
@@ -2615,8 +2629,8 @@
         <w:t xml:space="preserve">The pre-registered bootstrap of D under-corrected the noise term in resamples with repeated complaints. All confidence intervals for D reported here use the corrected bootstrap (noise term s²·Σw²/C²); the pre-registered intervals are in the repository result files for transparency, and no conclusion depends on the choice.</w:t>
       </w:r>
     </w:p>
-    <w:bookmarkEnd w:id="23"/>
-    <w:bookmarkStart w:id="24" w:name="X2427b43226ef08fc15bb5800b4bd3cab9c9333e"/>
+    <w:bookmarkEnd w:id="24"/>
+    <w:bookmarkStart w:id="25" w:name="X2427b43226ef08fc15bb5800b4bd3cab9c9333e"/>
     <w:p>
       <w:pPr>
         <w:pStyle w:val="Heading3"/>
@@ -2931,8 +2945,8 @@
         <w:t xml:space="preserve">edits) were each standardised into three styles, giving 55,800 standardising rewrites, 55,800 GPT-4o-mini decisions and Jev scoring of 55,001 unique texts. Of the standardised texts, 799 were word-for-word identical to another text and were therefore scored only once.</w:t>
       </w:r>
     </w:p>
-    <w:bookmarkEnd w:id="24"/>
-    <w:bookmarkStart w:id="25" w:name="Xb8568983d78c4e85e9dcc927a35f16d3df7bed1"/>
+    <w:bookmarkEnd w:id="25"/>
+    <w:bookmarkStart w:id="26" w:name="Xb8568983d78c4e85e9dcc927a35f16d3df7bed1"/>
     <w:p>
       <w:pPr>
         <w:pStyle w:val="Heading3"/>
@@ -3047,8 +3061,8 @@
         <w:t xml:space="preserve">edits. Differences between rules use a paired complaint bootstrap. The frozen H6 and materiality analyses used a plain quantile threshold. Because of ties, Jev's volume there was approximately rather than exactly matched: 9.0% vs 8.6% for GPT-4o-mini, and 11.45% vs 11.44% for GPT-5-mini. With exact matching, Jev's monetary-rate gaps change by at most 0.08 pp.</w:t>
       </w:r>
     </w:p>
-    <w:bookmarkEnd w:id="25"/>
-    <w:bookmarkStart w:id="26" w:name="X3057398570141ad758b3bfae7c10a298b92708a"/>
+    <w:bookmarkEnd w:id="26"/>
+    <w:bookmarkStart w:id="27" w:name="X3057398570141ad758b3bfae7c10a298b92708a"/>
     <w:p>
       <w:pPr>
         <w:pStyle w:val="Heading3"/>
@@ -3186,9 +3200,9 @@
         </w:pict>
       </w:r>
     </w:p>
-    <w:bookmarkEnd w:id="26"/>
     <w:bookmarkEnd w:id="27"/>
-    <w:bookmarkStart w:id="36" w:name="X121719332867ee227f0a04b486098cee978c6e6"/>
+    <w:bookmarkEnd w:id="28"/>
+    <w:bookmarkStart w:id="37" w:name="X121719332867ee227f0a04b486098cee978c6e6"/>
     <w:p>
       <w:pPr>
         <w:pStyle w:val="Heading2"/>
@@ -3197,7 +3211,7 @@
         <w:t xml:space="preserve">4. Results</w:t>
       </w:r>
     </w:p>
-    <w:bookmarkStart w:id="28" w:name="X9222d2bd3709386eb76e4f11dd29ffb157aacc3"/>
+    <w:bookmarkStart w:id="29" w:name="X9222d2bd3709386eb76e4f11dd29ffb157aacc3"/>
     <w:p>
       <w:pPr>
         <w:pStyle w:val="Heading3"/>
@@ -3476,8 +3490,8 @@
         <w:t xml:space="preserve">The paraphrase term may include persona effects specific to one rewrite model. So the persona share reported here is the part of persona variation that generalises across both generators, not all variation involving persona.</w:t>
       </w:r>
     </w:p>
-    <w:bookmarkEnd w:id="28"/>
-    <w:bookmarkStart w:id="29" w:name="X59a917edd1281747e0baf53cd11ed3b30c9223b"/>
+    <w:bookmarkEnd w:id="29"/>
+    <w:bookmarkStart w:id="30" w:name="X59a917edd1281747e0baf53cd11ed3b30c9223b"/>
     <w:p>
       <w:pPr>
         <w:pStyle w:val="Heading3"/>
@@ -3707,8 +3721,8 @@
         <w:t xml:space="preserve">A group gap is a net directional difference, in which shifts in opposite directions cancel. Pairwise disagreement is unsigned, so such shifts accumulate. The two quantities measure different things. Their ratio does not show which harm is larger, only that small average gaps can coexist with substantial individual instability.</w:t>
       </w:r>
     </w:p>
-    <w:bookmarkEnd w:id="29"/>
-    <w:bookmarkStart w:id="30" w:name="Xccdafce4be8f54e446d1805152701cc62314511"/>
+    <w:bookmarkEnd w:id="30"/>
+    <w:bookmarkStart w:id="31" w:name="Xccdafce4be8f54e446d1805152701cc62314511"/>
     <w:p>
       <w:pPr>
         <w:pStyle w:val="Heading3"/>
@@ -4007,8 +4021,8 @@
         <w:t xml:space="preserve">Order does not interact with education or SES effects.</w:t>
       </w:r>
     </w:p>
-    <w:bookmarkEnd w:id="30"/>
-    <w:bookmarkStart w:id="31" w:name="X0506506770722239d1e8bffd3401d3478bd660c"/>
+    <w:bookmarkEnd w:id="31"/>
+    <w:bookmarkStart w:id="32" w:name="X0506506770722239d1e8bffd3401d3478bd660c"/>
     <w:p>
       <w:pPr>
         <w:pStyle w:val="Heading3"/>
@@ -4080,8 +4094,8 @@
         <w:t xml:space="preserve">The three systems' group disparities differ by less than 1 pp, by the post hoc equivalence bound. We did not run a pre-registered extension that could have confirmed the GPT-4o-mini contrast, because any difference it could detect would lie below that bound. This judgement was made after the results were seen, and Appendix B records it.</w:t>
       </w:r>
     </w:p>
-    <w:bookmarkEnd w:id="31"/>
-    <w:bookmarkStart w:id="32" w:name="Xe07863926e5218924403bc25feb3802df2bb727"/>
+    <w:bookmarkEnd w:id="32"/>
+    <w:bookmarkStart w:id="33" w:name="Xe07863926e5218924403bc25feb3802df2bb727"/>
     <w:p>
       <w:pPr>
         <w:pStyle w:val="Heading3"/>
@@ -4483,8 +4497,8 @@
         <w:t xml:space="preserve">R² is 0.20–0.21 for content, compared with 0.04 for delivery. Because Jev also scores the attributes, this evidence is weaker than that for H-A2.</w:t>
       </w:r>
     </w:p>
-    <w:bookmarkEnd w:id="32"/>
-    <w:bookmarkStart w:id="33" w:name="X1c8f2863526d4a3eb3d03c8d51bd3dbe8b8610c"/>
+    <w:bookmarkEnd w:id="33"/>
+    <w:bookmarkStart w:id="34" w:name="X1c8f2863526d4a3eb3d03c8d51bd3dbe8b8610c"/>
     <w:p>
       <w:pPr>
         <w:pStyle w:val="Heading3"/>
@@ -4919,8 +4933,8 @@
         <w:t xml:space="preserve">raised argument quality.</w:t>
       </w:r>
     </w:p>
-    <w:bookmarkEnd w:id="33"/>
-    <w:bookmarkStart w:id="34" w:name="X7eac97638e6a19e1368fb6fec8c62cf5e2a09ef"/>
+    <w:bookmarkEnd w:id="34"/>
+    <w:bookmarkStart w:id="35" w:name="X7eac97638e6a19e1368fb6fec8c62cf5e2a09ef"/>
     <w:p>
       <w:pPr>
         <w:pStyle w:val="Heading3"/>
@@ -5639,8 +5653,8 @@
         <w:t xml:space="preserve">Standardised texts are rated as more formal (+0.38 on the [0, 1] scale) and less emotional (−0.14) than the guises.</w:t>
       </w:r>
     </w:p>
-    <w:bookmarkEnd w:id="34"/>
-    <w:bookmarkStart w:id="35" w:name="Xda28b8e419b43a2f4badfb5e5d79f9b0250601b"/>
+    <w:bookmarkEnd w:id="35"/>
+    <w:bookmarkStart w:id="36" w:name="Xda28b8e419b43a2f4badfb5e5d79f9b0250601b"/>
     <w:p>
       <w:pPr>
         <w:pStyle w:val="Heading3"/>
@@ -5997,9 +6011,9 @@
         </w:pict>
       </w:r>
     </w:p>
-    <w:bookmarkEnd w:id="35"/>
     <w:bookmarkEnd w:id="36"/>
-    <w:bookmarkStart w:id="42" w:name="X735612638e4e736e4693e459c258977262c0dfc"/>
+    <w:bookmarkEnd w:id="37"/>
+    <w:bookmarkStart w:id="43" w:name="X735612638e4e736e4693e459c258977262c0dfc"/>
     <w:p>
       <w:pPr>
         <w:pStyle w:val="Heading2"/>
@@ -6008,7 +6022,7 @@
         <w:t xml:space="preserve">5. Discussion</w:t>
       </w:r>
     </w:p>
-    <w:bookmarkStart w:id="37" w:name="Xab354815c8d1dd75bc21ab4d190058c7099ed41"/>
+    <w:bookmarkStart w:id="38" w:name="Xab354815c8d1dd75bc21ab4d190058c7099ed41"/>
     <w:p>
       <w:pPr>
         <w:pStyle w:val="Heading3"/>
@@ -6101,8 +6115,8 @@
         <w:t xml:space="preserve">Neither intervention resolves both problems. A system that standardises style can still give the same complaint a different remedy depending on how it happens to be worded. Standardisation also does not neutralise group differences uniformly: some vocabulary cues survive it, and for Jev it reversed two gaps. A system that averages probabilities produces smoother scores, but no reduction in profiling was detected (H3b). An audit that reports one aggregate disparity figure, or a mitigation evaluated against one, can hide the fact that only part of the problem has been addressed.</w:t>
       </w:r>
     </w:p>
-    <w:bookmarkEnd w:id="37"/>
-    <w:bookmarkStart w:id="38" w:name="X757ccdf071e442fa6cfc2cce9c3a463fbf3ab81"/>
+    <w:bookmarkEnd w:id="38"/>
+    <w:bookmarkStart w:id="39" w:name="X757ccdf071e442fa6cfc2cce9c3a463fbf3ab81"/>
     <w:p>
       <w:pPr>
         <w:pStyle w:val="Heading3"/>
@@ -6135,8 +6149,8 @@
         <w:t xml:space="preserve">Group-rate tests remain necessary: they detected a real, replicated and directional signal. They should not be the only test.</w:t>
       </w:r>
     </w:p>
-    <w:bookmarkEnd w:id="38"/>
-    <w:bookmarkStart w:id="39" w:name="X85ab69caf91f1d79fccce628b8c7cafc7adde08"/>
+    <w:bookmarkEnd w:id="39"/>
+    <w:bookmarkStart w:id="40" w:name="X85ab69caf91f1d79fccce628b8c7cafc7adde08"/>
     <w:p>
       <w:pPr>
         <w:pStyle w:val="Heading3"/>
@@ -6258,8 +6272,8 @@
         <w:t xml:space="preserve">The attribute decomposition suggested that standardising delivery would reduce the gaps, and for GPT-4o-mini it did. For Jev, the same standardiser reversed two gaps. A mitigation must be audited with the same design as the system it corrects.</w:t>
       </w:r>
     </w:p>
-    <w:bookmarkEnd w:id="39"/>
-    <w:bookmarkStart w:id="40" w:name="X6cfcedbfecd93efb79ad6b593c6bd96e241ec76"/>
+    <w:bookmarkEnd w:id="40"/>
+    <w:bookmarkStart w:id="41" w:name="X6cfcedbfecd93efb79ad6b593c6bd96e241ec76"/>
     <w:p>
       <w:pPr>
         <w:pStyle w:val="Heading3"/>
@@ -6347,8 +6361,8 @@
         <w:t xml:space="preserve">It made complaints less emotional (−0.14) and more formal. For most remedy decisions, that is the intent. However, distress can signal consumer vulnerability, which some regulators expect firms to recognise [e.g. FCA, 2021]. A standardised text should feed the remedy decision, not replace the original in the case record or in human review.</w:t>
       </w:r>
     </w:p>
-    <w:bookmarkEnd w:id="40"/>
-    <w:bookmarkStart w:id="41" w:name="Xda8570678e151ca9d6064c17e17b845197c917e"/>
+    <w:bookmarkEnd w:id="41"/>
+    <w:bookmarkStart w:id="42" w:name="Xda8570678e151ca9d6064c17e17b845197c917e"/>
     <w:p>
       <w:pPr>
         <w:pStyle w:val="Heading3"/>
@@ -6413,9 +6427,9 @@
         </w:pict>
       </w:r>
     </w:p>
-    <w:bookmarkEnd w:id="41"/>
     <w:bookmarkEnd w:id="42"/>
-    <w:bookmarkStart w:id="43" w:name="X07495bb7d7ff3c50206f872d4766169330a61ca"/>
+    <w:bookmarkEnd w:id="43"/>
+    <w:bookmarkStart w:id="44" w:name="X07495bb7d7ff3c50206f872d4766169330a61ca"/>
     <w:p>
       <w:pPr>
         <w:pStyle w:val="Heading2"/>
@@ -6662,8 +6676,8 @@
         </w:pict>
       </w:r>
     </w:p>
-    <w:bookmarkEnd w:id="43"/>
-    <w:bookmarkStart w:id="44" w:name="X5d924a6541c4a504da51fe794b08aa42729b844"/>
+    <w:bookmarkEnd w:id="44"/>
+    <w:bookmarkStart w:id="45" w:name="X5d924a6541c4a504da51fe794b08aa42729b844"/>
     <w:p>
       <w:pPr>
         <w:pStyle w:val="Heading2"/>
@@ -6804,10 +6818,13 @@
         <w:rPr>
           <w:rStyle w:val="VerbatimChar"/>
         </w:rPr>
-        <w:t xml:space="preserve">prereg``/README.md</w:t>
-      </w:r>
-      <w:r>
-        <w:t xml:space="preserve">).</w:t>
+        <w:t xml:space="preserve">prereg/README.md</w:t>
+      </w:r>
+      <w:r>
+        <w:t xml:space="preserve"> </w:t>
+      </w:r>
+      <w:r>
+        <w:t xml:space="preserve">in the anonymised repository).</w:t>
       </w:r>
     </w:p>
     <w:p>
@@ -6853,8 +6870,8 @@
         </w:pict>
       </w:r>
     </w:p>
-    <w:bookmarkEnd w:id="44"/>
-    <w:bookmarkStart w:id="45" w:name="X068cadce569253993d0037f110a97f237619c0f"/>
+    <w:bookmarkEnd w:id="45"/>
+    <w:bookmarkStart w:id="46" w:name="X068cadce569253993d0037f110a97f237619c0f"/>
     <w:p>
       <w:pPr>
         <w:pStyle w:val="Heading2"/>
@@ -6886,8 +6903,8 @@
         </w:pict>
       </w:r>
     </w:p>
-    <w:bookmarkEnd w:id="45"/>
-    <w:bookmarkStart w:id="46" w:name="X9673ec5dd1fdaa65d6ef0b74cca653d718e880a"/>
+    <w:bookmarkEnd w:id="46"/>
+    <w:bookmarkStart w:id="47" w:name="X9673ec5dd1fdaa65d6ef0b74cca653d718e880a"/>
     <w:p>
       <w:pPr>
         <w:pStyle w:val="Heading2"/>
@@ -6901,7 +6918,21 @@
         <w:pStyle w:val="FirstParagraph"/>
       </w:pPr>
       <w:r>
-        <w:t xml:space="preserve">Times are Australian Eastern Standard Time (AEST, UTC+10), taken from the commit timestamps in the anonymised repository [anonymous URL to be inserted]. The commit identifiers will be verifiable in the de-anonymised repository.</w:t>
+        <w:t xml:space="preserve">Times are Australian Eastern Standard Time (AEST, UTC+10), taken from the commit timestamps in the anonymised repository</w:t>
+      </w:r>
+      <w:r>
+        <w:t xml:space="preserve"> </w:t>
+      </w:r>
+      <w:hyperlink r:id="rId23">
+        <w:r>
+          <w:rPr>
+            <w:rStyle w:val="Hyperlink"/>
+          </w:rPr>
+          <w:t xml:space="preserve">https://anonymous.4open.science/r/llm-jev-linguistic-profiling-6AC8/</w:t>
+        </w:r>
+      </w:hyperlink>
+      <w:r>
+        <w:t xml:space="preserve">. The commit identifiers will be verifiable in the de-anonymised repository.</w:t>
       </w:r>
     </w:p>
     <w:tbl>
@@ -7858,8 +7889,8 @@
         <w:t xml:space="preserve">Pre-registration 5 recorded two changes before its freeze: GPT-5.2 replaced a planned Google auditor, whose API key was invalid, and the guise sample was enlarged from 24 to 40 complaints after the smoke run showed lower costs than expected.</w:t>
       </w:r>
     </w:p>
-    <w:bookmarkEnd w:id="46"/>
-    <w:bookmarkStart w:id="47" w:name="X34cfaee19e5e0ba04f832d96fd18ec852973967"/>
+    <w:bookmarkEnd w:id="47"/>
+    <w:bookmarkStart w:id="48" w:name="X34cfaee19e5e0ba04f832d96fd18ec852973967"/>
     <w:p>
       <w:pPr>
         <w:pStyle w:val="Heading2"/>
@@ -8629,8 +8660,8 @@
         <w:t xml:space="preserve">The reported persona share (1.6% for p2, 1.7% for E[tier]) is K + C×K: persona variation that replicates across both rewrite generators and all option orders. Persona interactions with option order are negligible (≤ 0.05%), and the persona × bank main interaction is ≤ 0.12%. The C×K×B term cannot be split, in this design, into bank-specific persona effects and guise-level paraphrase.</w:t>
       </w:r>
     </w:p>
-    <w:bookmarkEnd w:id="47"/>
-    <w:bookmarkStart w:id="48" w:name="X38a8c6cedc75a0f58d981684dd7b4984e9071cc"/>
+    <w:bookmarkEnd w:id="48"/>
+    <w:bookmarkStart w:id="49" w:name="X38a8c6cedc75a0f58d981684dd7b4984e9071cc"/>
     <w:p>
       <w:pPr>
         <w:pStyle w:val="Heading2"/>
@@ -9676,8 +9707,8 @@
         </w:tc>
       </w:tr>
     </w:tbl>
-    <w:bookmarkEnd w:id="48"/>
     <w:bookmarkEnd w:id="49"/>
+    <w:bookmarkEnd w:id="50"/>
     <w:sectPr>
       <w:footnotePr>
         <w:numRestart w:val="eachSect"/>

</xml_diff>

<commit_message>
Submission prep: OpenReview abstract text; GenAI statement draft; move competing interests and funding to camera-ready (FAccT anonymity policy)
Co-Authored-By: Claude Opus 5.5 (1M context) <noreply@anthropic.com>
</commit_message>
<xml_diff>
--- a/paper_out/draft_methods_results_revised.docx
+++ b/paper_out/draft_methods_results_revised.docx
@@ -6836,31 +6836,13 @@
           <w:b/>
           <w:bCs/>
         </w:rPr>
-        <w:t xml:space="preserve">Competing interests.</w:t>
-      </w:r>
-      <w:r>
-        <w:t xml:space="preserve"> </w:t>
-      </w:r>
-      <w:r>
-        <w:t xml:space="preserve">The author declares no competing interests.</w:t>
-      </w:r>
-    </w:p>
-    <w:p>
-      <w:pPr>
-        <w:pStyle w:val="BodyText"/>
-      </w:pPr>
-      <w:r>
-        <w:rPr>
-          <w:b/>
-          <w:bCs/>
-        </w:rPr>
-        <w:t xml:space="preserve">Funding.</w:t>
-      </w:r>
-      <w:r>
-        <w:t xml:space="preserve"> </w:t>
-      </w:r>
-      <w:r>
-        <w:t xml:space="preserve">This research received no external funding.</w:t>
+        <w:t xml:space="preserve">Generative AI usage statement.</w:t>
+      </w:r>
+      <w:r>
+        <w:t xml:space="preserve"> </w:t>
+      </w:r>
+      <w:r>
+        <w:t xml:space="preserve">[AUTHOR TO CONFIRM MODEL VERSIONS] Claude (Anthropic; Claude Opus 5.5 in Claude Code) was used to write and run the analysis code, draft and revise the text of all sections from the author's instructions, build the figures and tables, and check citations against primary sources. ChatGPT (OpenAI; [version]) was used to produce adversarial reviews of two drafts, which the author used to direct revisions. The author reviewed and takes responsibility for all code, analyses, text and references. The language models studied, and the LLM auditors used in the fact-fidelity audit (Claude Opus 5.5, GPT-5.2), are part of the method and are described in §3.</w:t>
       </w:r>
     </w:p>
     <w:p>

</xml_diff>